<commit_message>
Ground citations in source PDFs: exact Holler-Werner title, Tikkun 18 details, align Hughes claim to abstract
Co-Authored-By: Claude <noreply@anthropic.com>
</commit_message>
<xml_diff>
--- a/מוגבלות_וסיכון_רפלקציה_זוגי.docx
+++ b/מוגבלות_וסיכון_רפלקציה_זוגי.docx
@@ -610,7 +610,7 @@
           <w:szCs w:val="24"/>
           <w:rtl w:val="1"/>
         </w:rPr>
-        <w:t>נקודת המוצא היא שהחשיפה לסיכון איננה מקרית. סקירה שיטתית ומטא-אנליזה רחבה מצאו שמבוגרים עם מוגבלות נמצאים בסיכון גבוה משמעותית לחוות אלימות בהשוואה למבוגרים ללא מוגבלות, ושדווקא אנשים עם מוגבלות המלווה בקושי תקשורתי או קוגניטיבי חשופים יותר (Hughes et al., 2012). הקושי לתקשר את הפגיעה, לזהות אותה כפגיעה או להתלונן עליה הוא בדיוק מה שהופך אדם למטרה קלה, ולכן ההגנה כאן איננה מותרות אלא הכרח.</w:t>
+        <w:t>נקודת המוצא היא שהחשיפה לסיכון איננה מקרית. סקירה שיטתית ומטא-אנליזה רחבה מצאו שמבוגרים עם מוגבלות נמצאים בסיכון גבוה משמעותית לחוות אלימות בהשוואה למבוגרים ללא מוגבלות, ושאנשים עם מוגבלות נפשית עלולים להיות פגיעים במיוחד (Hughes et al., 2012). הקושי לתקשר את הפגיעה, לזהות אותה כפגיעה או להתלונן עליה הוא בדיוק מה שהופך אדם למטרה קלה, ולכן ההגנה כאן איננה מותרות אלא הכרח.</w:t>
       </w:r>
     </w:p>
     <w:p>
@@ -664,7 +664,7 @@
           <w:szCs w:val="24"/>
           <w:rtl w:val="1"/>
         </w:rPr>
-        <w:t>ההשלכה המעשית מתבררת בעבודה של אנשי המקצוע בשטח. מחקר ישראלי שבחן תפיסות ושיקולים של עובדות סוציאליות בתהליכי מינוי אפוטרופסות מול קבלת החלטות נתמכת מצא שהבחירה בין השתיים רחוקה מלהיות טכנית, ושהיא נשענת על עמדות עמוקות של אנשי המקצוע לגבי מסוגלות, סיכון ואחריות. הכותבות מציעות לעבור מברירת המחדל של אפוטרופסות, שמעבירה את מלוא ההחלטה לידי אחר, אל מודל של תמיכה שבו האדם נשאר בעל ההחלטה ומקבל סביבו מעגל שעוזר לו להבין, לשקול ולבחור (הולר וורנר, 2025). הגישה הזאת שוברת את הקישור האוטומטי בין קושי בקבלת החלטות לבין שלילת הזכות להחליט.</w:t>
+        <w:t>ההשלכה המעשית מתבררת בעבודה של אנשי המקצוע בשטח. מחקר ישראלי שבחן תפיסות ושיקולים של עובדות סוציאליות בתהליכי מינוי אפוטרופסות מול קבלת החלטות נתמכת מצא שלמרות תיקון 18 לחוק הכשרות המשפטית משנת 2016, שנועד לצמצם את השימוש באפוטרופסות ולקדם חלופות כמו קבלת החלטות נתמכת, נותר פער בין חזון הרפורמה לבין הפרקטיקה בשטח. הבחירה בין אפוטרופסות לתמיכה רחוקה מלהיות טכנית, והיא נשענת על תפיסות של אנשי המקצוע לגבי אבחון האדם, רמת התפקוד שלו ורצונו, ועל מטרות של מניעת סיכון וקידום איכות חיים. הכותבות ממליצות על שינוי בהכשרה ובמדיניות שיאפשר מעבר ממודל האפוטרופסות אל מודל של תמיכה, שבו האדם נשאר בעל ההחלטה ומקבל סביבו מעגל שעוזר לו להבין, לשקול ולבחור (הולר וורנר, 2025). הגישה הזאת שוברת את הקישור האוטומטי בין קושי בקבלת החלטות לבין שלילת הזכות להחליט.</w:t>
       </w:r>
     </w:p>
     <w:p>
@@ -724,7 +724,7 @@
           <w:szCs w:val="24"/>
           <w:rtl w:val="1"/>
         </w:rPr>
-        <w:t xml:space="preserve">הולר, ר', וורנר, ש' (2025). תפיסות ושיקולים של עובדות סוציאליות בתהליכי מינוי אפוטרופסות וקבלת החלטות נתמכת בקרב אנשים עם מוגבלות. </w:t>
+        <w:t xml:space="preserve">הולר, ר', וורנר, ש' (2025). תפיסות ושיקולים של עובדות סוציאליות בתהליכי מינוי של אפוטרופסות וקבלת החלטות נתמכת בקרב אנשים עם מוגבלויות: המלצות להכשרה ולמדיניות. </w:t>
       </w:r>
       <w:r>
         <w:rPr>

</xml_diff>

<commit_message>
Fill Miriam's name and ID on title page (Miriam Alaasam, 211455274)
Co-Authored-By: Claude <noreply@anthropic.com>
</commit_message>
<xml_diff>
--- a/מוגבלות_וסיכון_רפלקציה_זוגי.docx
+++ b/מוגבלות_וסיכון_רפלקציה_זוגי.docx
@@ -140,7 +140,7 @@
           <w:szCs w:val="26"/>
           <w:rtl w:val="1"/>
         </w:rPr>
-        <w:t>מגישות: מרים ___________  והדיר ___________</w:t>
+        <w:t>מגישות: מרים אלאעסם  והדיר ___________</w:t>
       </w:r>
     </w:p>
     <w:p>
@@ -158,7 +158,7 @@
           <w:szCs w:val="26"/>
           <w:rtl w:val="1"/>
         </w:rPr>
-        <w:t>ת.ז: ___________  |  ___________</w:t>
+        <w:t>ת.ז: 211455274  |  ___________</w:t>
       </w:r>
     </w:p>
     <w:p>

</xml_diff>